<commit_message>
docs: Update SoW, Developer Guide, and add User Manual v2.2
- Updated SoW with mobile app features, Microsoft SSO, mobile APIs,
  CUSTOMER role, Phase 9 (Mobile), updated timeline to 35 weeks
- Regenerated SoW .docx and diagrams
- Updated Developer Guide with mobile API section, Microsoft auth,
  new components, updated project structure, section 17 (Mobile API)
- Created comprehensive User Manual covering all system features
- Includes all previously staged source code changes
</commit_message>
<xml_diff>
--- a/sow_documents/SPARKING_Statement_of_Work.docx
+++ b/sow_documents/SPARKING_Statement_of_Work.docx
@@ -59,9 +59,9 @@
           <w:color w:val="757575"/>
           <w:sz w:val="24"/>
         </w:rPr>
-        <w:t>Version 1.0</w:t>
+        <w:t>Version 2.0</w:t>
         <w:br/>
-        <w:t>January 2026</w:t>
+        <w:t>February 2026</w:t>
       </w:r>
     </w:p>
     <w:p>
@@ -250,7 +250,7 @@
               <w:rPr>
                 <w:sz w:val="24"/>
               </w:rPr>
-              <w:t>8</w:t>
+              <w:t>9</w:t>
             </w:r>
           </w:p>
         </w:tc>
@@ -305,7 +305,7 @@
               <w:rPr>
                 <w:sz w:val="24"/>
               </w:rPr>
-              <w:t>11</w:t>
+              <w:t>13</w:t>
             </w:r>
           </w:p>
         </w:tc>
@@ -360,7 +360,7 @@
               <w:rPr>
                 <w:sz w:val="24"/>
               </w:rPr>
-              <w:t>12</w:t>
+              <w:t>14</w:t>
             </w:r>
           </w:p>
         </w:tc>
@@ -415,7 +415,7 @@
               <w:rPr>
                 <w:sz w:val="24"/>
               </w:rPr>
-              <w:t>13</w:t>
+              <w:t>16</w:t>
             </w:r>
           </w:p>
         </w:tc>
@@ -470,7 +470,7 @@
               <w:rPr>
                 <w:sz w:val="24"/>
               </w:rPr>
-              <w:t>16</w:t>
+              <w:t>19</w:t>
             </w:r>
           </w:p>
         </w:tc>
@@ -525,7 +525,7 @@
               <w:rPr>
                 <w:sz w:val="24"/>
               </w:rPr>
-              <w:t>18</w:t>
+              <w:t>21</w:t>
             </w:r>
           </w:p>
         </w:tc>
@@ -562,7 +562,7 @@
               <w:rPr>
                 <w:sz w:val="24"/>
               </w:rPr>
-              <w:t>API Documentation</w:t>
+              <w:t>API Documentation (89+ Endpoints)</w:t>
             </w:r>
           </w:p>
         </w:tc>
@@ -580,7 +580,7 @@
               <w:rPr>
                 <w:sz w:val="24"/>
               </w:rPr>
-              <w:t>20</w:t>
+              <w:t>23</w:t>
             </w:r>
           </w:p>
         </w:tc>
@@ -635,7 +635,7 @@
               <w:rPr>
                 <w:sz w:val="24"/>
               </w:rPr>
-              <w:t>25</w:t>
+              <w:t>29</w:t>
             </w:r>
           </w:p>
         </w:tc>
@@ -709,15 +709,21 @@
       <w:r>
         <w:t>Key Differentiators:</w:t>
         <w:br/>
-        <w:t>1. AI-Powered Detection: Utilizes Intel OpenVINO and YOLOv8 for real-time vehicle and license plate detection with 95%+ accuracy</w:t>
+        <w:t>1. AI-Powered Detection: Utilizes Intel OpenVINO and YOLOv8/v10 for real-time vehicle and license plate detection with 95%+ accuracy</w:t>
         <w:br/>
-        <w:t>2. Scalable Architecture: Microservices-based design supporting multiple venues with thousands of parking slots</w:t>
+        <w:t>2. Intel Hardware Acceleration: Native support for Intel GPU and Intel NPU with optimized inference pipelines achieving &lt;100ms latency</w:t>
         <w:br/>
-        <w:t>3. Integrated Wallet System: PayPal-like digital wallet with P2P transfers, KYC verification, and multi-gateway support</w:t>
+        <w:t>3. Scalable Architecture: Microservices-based design supporting multiple venues with thousands of parking slots</w:t>
         <w:br/>
-        <w:t>4. Real-time Operations: Socket.IO and MQTT-based real-time updates for instant occupancy changes</w:t>
+        <w:t>4. Integrated Wallet System: PayPal-like digital wallet with P2P transfers, KYC verification, and multi-gateway support</w:t>
         <w:br/>
-        <w:t>5. Hardware Agnostic: Compatible with existing CCTV infrastructure through RTSP/ONVIF protocols</w:t>
+        <w:t>5. Real-time Operations: Socket.IO and MQTT-based real-time updates for instant occupancy changes</w:t>
+        <w:br/>
+        <w:t>6. Hardware Agnostic: Compatible with existing CCTV infrastructure through RTSP/ONVIF protocols</w:t>
+        <w:br/>
+        <w:t>7. Mobile App: Native mobile application built with Expo/React Native for customer self-service parking, vehicle management, and mobile payments</w:t>
+        <w:br/>
+        <w:t>8. Microsoft SSO: Enterprise-grade Single Sign-On via Microsoft Azure AD/MSAL for seamless corporate integration</w:t>
       </w:r>
     </w:p>
     <w:p>
@@ -897,10 +903,38 @@
         <w:rPr>
           <w:b/>
         </w:rPr>
+        <w:t xml:space="preserve">Intel OpenVINO Integration: </w:t>
+      </w:r>
+      <w:r>
+        <w:t>Deep integration with Intel OpenVINO 2024.0+ for optimized inference on Intel CPUs, GPUs, and NPUs</w:t>
+      </w:r>
+    </w:p>
+    <w:p>
+      <w:pPr>
+        <w:pStyle w:val="ListBullet"/>
+      </w:pPr>
+      <w:r>
+        <w:rPr>
+          <w:b/>
+        </w:rPr>
+        <w:t xml:space="preserve">Intel GPU/NPU Acceleration: </w:t>
+      </w:r>
+      <w:r>
+        <w:t>Hardware-accelerated inference with FP16 precision on Intel GPU and INT8 on Intel NPU for maximum throughput</w:t>
+      </w:r>
+    </w:p>
+    <w:p>
+      <w:pPr>
+        <w:pStyle w:val="ListBullet"/>
+      </w:pPr>
+      <w:r>
+        <w:rPr>
+          <w:b/>
+        </w:rPr>
         <w:t xml:space="preserve">Edge Processing: </w:t>
       </w:r>
       <w:r>
-        <w:t>On-premise AI inference for reduced latency and enhanced privacy</w:t>
+        <w:t>On-premise AI inference for reduced latency (&lt;100ms target) and enhanced privacy</w:t>
       </w:r>
     </w:p>
     <w:p>
@@ -919,6 +953,20 @@
     </w:p>
     <w:p>
       <w:pPr>
+        <w:pStyle w:val="ListBullet"/>
+      </w:pPr>
+      <w:r>
+        <w:rPr>
+          <w:b/>
+        </w:rPr>
+        <w:t xml:space="preserve">Adaptive Frame Processing: </w:t>
+      </w:r>
+      <w:r>
+        <w:t>Intelligent frame skipping and batch processing optimized for Intel hardware to maintain target FPS</w:t>
+      </w:r>
+    </w:p>
+    <w:p>
+      <w:pPr>
         <w:pStyle w:val="Heading2"/>
       </w:pPr>
       <w:r>
@@ -1226,7 +1274,219 @@
         <w:pStyle w:val="Heading2"/>
       </w:pPr>
       <w:r>
-        <w:t>2.6 User Management &amp; Access Control</w:t>
+        <w:t>2.6 Mobile Application</w:t>
+      </w:r>
+    </w:p>
+    <w:p>
+      <w:pPr>
+        <w:pStyle w:val="ListBullet"/>
+      </w:pPr>
+      <w:r>
+        <w:rPr>
+          <w:b/>
+        </w:rPr>
+        <w:t xml:space="preserve">Customer Self-Service: </w:t>
+      </w:r>
+      <w:r>
+        <w:t>Native mobile app (Expo/React Native) for customers to manage parking sessions, vehicles, and payments</w:t>
+      </w:r>
+    </w:p>
+    <w:p>
+      <w:pPr>
+        <w:pStyle w:val="ListBullet"/>
+      </w:pPr>
+      <w:r>
+        <w:rPr>
+          <w:b/>
+        </w:rPr>
+        <w:t xml:space="preserve">Vehicle Management: </w:t>
+      </w:r>
+      <w:r>
+        <w:t>Add, edit, and delete vehicles with license plate, make, model, color, and type</w:t>
+      </w:r>
+    </w:p>
+    <w:p>
+      <w:pPr>
+        <w:pStyle w:val="ListBullet"/>
+      </w:pPr>
+      <w:r>
+        <w:rPr>
+          <w:b/>
+        </w:rPr>
+        <w:t xml:space="preserve">Session Management: </w:t>
+      </w:r>
+      <w:r>
+        <w:t>View active and past parking sessions, create new sessions, and mark exits</w:t>
+      </w:r>
+    </w:p>
+    <w:p>
+      <w:pPr>
+        <w:pStyle w:val="ListBullet"/>
+      </w:pPr>
+      <w:r>
+        <w:rPr>
+          <w:b/>
+        </w:rPr>
+        <w:t xml:space="preserve">Mobile Wallet: </w:t>
+      </w:r>
+      <w:r>
+        <w:t>View wallet balance, deposit funds, and track transaction history from the mobile app</w:t>
+      </w:r>
+    </w:p>
+    <w:p>
+      <w:pPr>
+        <w:pStyle w:val="ListBullet"/>
+      </w:pPr>
+      <w:r>
+        <w:rPr>
+          <w:b/>
+        </w:rPr>
+        <w:t xml:space="preserve">Mobile Payments: </w:t>
+      </w:r>
+      <w:r>
+        <w:t>Process parking payments directly from the mobile app with wallet or gateway integration</w:t>
+      </w:r>
+    </w:p>
+    <w:p>
+      <w:pPr>
+        <w:pStyle w:val="ListBullet"/>
+      </w:pPr>
+      <w:r>
+        <w:rPr>
+          <w:b/>
+        </w:rPr>
+        <w:t xml:space="preserve">QR Code Validation: </w:t>
+      </w:r>
+      <w:r>
+        <w:t>Scan and validate parking QR codes for entry/exit</w:t>
+      </w:r>
+    </w:p>
+    <w:p>
+      <w:pPr>
+        <w:pStyle w:val="ListBullet"/>
+      </w:pPr>
+      <w:r>
+        <w:rPr>
+          <w:b/>
+        </w:rPr>
+        <w:t xml:space="preserve">Push Notifications: </w:t>
+      </w:r>
+      <w:r>
+        <w:t>Receive real-time notifications for parking events, payment confirmations, and session alerts</w:t>
+      </w:r>
+    </w:p>
+    <w:p>
+      <w:pPr>
+        <w:pStyle w:val="ListBullet"/>
+      </w:pPr>
+      <w:r>
+        <w:rPr>
+          <w:b/>
+        </w:rPr>
+        <w:t xml:space="preserve">Parking Lot Discovery: </w:t>
+      </w:r>
+      <w:r>
+        <w:t>Browse available parking lots with real-time availability, zones, and slot details</w:t>
+      </w:r>
+    </w:p>
+    <w:p>
+      <w:pPr>
+        <w:pStyle w:val="ListBullet"/>
+      </w:pPr>
+      <w:r>
+        <w:rPr>
+          <w:b/>
+        </w:rPr>
+        <w:t xml:space="preserve">User Profile: </w:t>
+      </w:r>
+      <w:r>
+        <w:t>Manage profile information, phone number, and notification preferences</w:t>
+      </w:r>
+    </w:p>
+    <w:p>
+      <w:pPr>
+        <w:pStyle w:val="Heading2"/>
+      </w:pPr>
+      <w:r>
+        <w:t>2.7 Authentication &amp; Single Sign-On</w:t>
+      </w:r>
+    </w:p>
+    <w:p>
+      <w:pPr>
+        <w:pStyle w:val="ListBullet"/>
+      </w:pPr>
+      <w:r>
+        <w:rPr>
+          <w:b/>
+        </w:rPr>
+        <w:t xml:space="preserve">Email/Password Login: </w:t>
+      </w:r>
+      <w:r>
+        <w:t>Traditional email and password authentication with bcrypt hashing</w:t>
+      </w:r>
+    </w:p>
+    <w:p>
+      <w:pPr>
+        <w:pStyle w:val="ListBullet"/>
+      </w:pPr>
+      <w:r>
+        <w:rPr>
+          <w:b/>
+        </w:rPr>
+        <w:t xml:space="preserve">Microsoft SSO: </w:t>
+      </w:r>
+      <w:r>
+        <w:t>Enterprise Single Sign-On via Microsoft Azure AD using MSAL (Microsoft Authentication Library)</w:t>
+      </w:r>
+    </w:p>
+    <w:p>
+      <w:pPr>
+        <w:pStyle w:val="ListBullet"/>
+      </w:pPr>
+      <w:r>
+        <w:rPr>
+          <w:b/>
+        </w:rPr>
+        <w:t xml:space="preserve">JWT Sessions: </w:t>
+      </w:r>
+      <w:r>
+        <w:t>Stateless JWT tokens with database-backed session validation for immediate revocation</w:t>
+      </w:r>
+    </w:p>
+    <w:p>
+      <w:pPr>
+        <w:pStyle w:val="ListBullet"/>
+      </w:pPr>
+      <w:r>
+        <w:rPr>
+          <w:b/>
+        </w:rPr>
+        <w:t xml:space="preserve">Token Refresh: </w:t>
+      </w:r>
+      <w:r>
+        <w:t>Mobile app token refresh mechanism for seamless session continuity</w:t>
+      </w:r>
+    </w:p>
+    <w:p>
+      <w:pPr>
+        <w:pStyle w:val="ListBullet"/>
+      </w:pPr>
+      <w:r>
+        <w:rPr>
+          <w:b/>
+        </w:rPr>
+        <w:t xml:space="preserve">Rate-Limited Auth: </w:t>
+      </w:r>
+      <w:r>
+        <w:t>Login and registration endpoints protected with rate limiting (5/min login, 3/min register)</w:t>
+      </w:r>
+    </w:p>
+    <w:p>
+      <w:pPr>
+        <w:pStyle w:val="Heading2"/>
+      </w:pPr>
+      <w:r>
+        <w:t>2.8 User Management &amp; Access Control</w:t>
       </w:r>
     </w:p>
     <w:p>
@@ -1240,7 +1500,7 @@
         <w:t xml:space="preserve">Role-Based Access: </w:t>
       </w:r>
       <w:r>
-        <w:t>Five user roles: Super Admin, Admin, Operator, Auditor, Viewer</w:t>
+        <w:t>Six user roles: Super Admin, Admin, Operator, Auditor, Viewer, Customer</w:t>
       </w:r>
     </w:p>
     <w:p>
@@ -1304,7 +1564,7 @@
         <w:pStyle w:val="Heading2"/>
       </w:pPr>
       <w:r>
-        <w:t>2.7 Notifications &amp; Alerts</w:t>
+        <w:t>2.9 Notifications &amp; Alerts</w:t>
       </w:r>
     </w:p>
     <w:p>
@@ -1382,7 +1642,7 @@
         <w:pStyle w:val="Heading2"/>
       </w:pPr>
       <w:r>
-        <w:t>2.8 Hardware Integration</w:t>
+        <w:t>2.10 Hardware Integration</w:t>
       </w:r>
     </w:p>
     <w:p>
@@ -2431,7 +2691,7 @@
           </w:tcPr>
           <w:p>
             <w:r>
-              <w:t>2024.0.0+</w:t>
+              <w:t>2024.0.0+ (Core runtime)</w:t>
             </w:r>
           </w:p>
         </w:tc>
@@ -2443,6 +2703,70 @@
           </w:tcPr>
           <w:p>
             <w:r>
+              <w:t>OpenVINO Dev Tools</w:t>
+            </w:r>
+          </w:p>
+        </w:tc>
+        <w:tc>
+          <w:tcPr>
+            <w:tcW w:type="dxa" w:w="3135"/>
+          </w:tcPr>
+          <w:p>
+            <w:r>
+              <w:t>openvino-dev</w:t>
+            </w:r>
+          </w:p>
+        </w:tc>
+        <w:tc>
+          <w:tcPr>
+            <w:tcW w:type="dxa" w:w="3135"/>
+          </w:tcPr>
+          <w:p>
+            <w:r>
+              <w:t>Model optimization &amp; conversion</w:t>
+            </w:r>
+          </w:p>
+        </w:tc>
+      </w:tr>
+      <w:tr>
+        <w:tc>
+          <w:tcPr>
+            <w:tcW w:type="dxa" w:w="3135"/>
+          </w:tcPr>
+          <w:p>
+            <w:r>
+              <w:t>Hardware Support</w:t>
+            </w:r>
+          </w:p>
+        </w:tc>
+        <w:tc>
+          <w:tcPr>
+            <w:tcW w:type="dxa" w:w="3135"/>
+          </w:tcPr>
+          <w:p>
+            <w:r>
+              <w:t>Intel GPU/NPU</w:t>
+            </w:r>
+          </w:p>
+        </w:tc>
+        <w:tc>
+          <w:tcPr>
+            <w:tcW w:type="dxa" w:w="3135"/>
+          </w:tcPr>
+          <w:p>
+            <w:r>
+              <w:t>FP16/INT8 acceleration</w:t>
+            </w:r>
+          </w:p>
+        </w:tc>
+      </w:tr>
+      <w:tr>
+        <w:tc>
+          <w:tcPr>
+            <w:tcW w:type="dxa" w:w="3135"/>
+          </w:tcPr>
+          <w:p>
+            <w:r>
               <w:t>Object Detection</w:t>
             </w:r>
           </w:p>
@@ -2463,7 +2787,7 @@
           </w:tcPr>
           <w:p>
             <w:r>
-              <w:t>8.0.0+</w:t>
+              <w:t>8.0.0+ (OpenVINO export)</w:t>
             </w:r>
           </w:p>
         </w:tc>
@@ -2666,7 +2990,7 @@
         <w:pStyle w:val="Heading2"/>
       </w:pPr>
       <w:r>
-        <w:t>3.4 DevOps &amp; Infrastructure</w:t>
+        <w:t>3.4 Mobile Application</w:t>
       </w:r>
     </w:p>
     <w:tbl>
@@ -2684,7 +3008,7 @@
         <w:tc>
           <w:tcPr>
             <w:tcW w:type="dxa" w:w="3135"/>
-            <w:shd w:fill="e65100"/>
+            <w:shd w:fill="00838f"/>
           </w:tcPr>
           <w:p>
             <w:r>
@@ -2699,7 +3023,7 @@
         <w:tc>
           <w:tcPr>
             <w:tcW w:type="dxa" w:w="3135"/>
-            <w:shd w:fill="e65100"/>
+            <w:shd w:fill="00838f"/>
           </w:tcPr>
           <w:p>
             <w:r>
@@ -2714,7 +3038,7 @@
         <w:tc>
           <w:tcPr>
             <w:tcW w:type="dxa" w:w="3135"/>
-            <w:shd w:fill="e65100"/>
+            <w:shd w:fill="00838f"/>
           </w:tcPr>
           <w:p>
             <w:r>
@@ -2734,27 +3058,27 @@
           </w:tcPr>
           <w:p>
             <w:r>
-              <w:t>Containerization</w:t>
-            </w:r>
-          </w:p>
-        </w:tc>
-        <w:tc>
-          <w:tcPr>
-            <w:tcW w:type="dxa" w:w="3135"/>
-          </w:tcPr>
-          <w:p>
-            <w:r>
-              <w:t>Docker</w:t>
-            </w:r>
-          </w:p>
-        </w:tc>
-        <w:tc>
-          <w:tcPr>
-            <w:tcW w:type="dxa" w:w="3135"/>
-          </w:tcPr>
-          <w:p>
-            <w:r>
-              <w:t>Latest</w:t>
+              <w:t>Framework</w:t>
+            </w:r>
+          </w:p>
+        </w:tc>
+        <w:tc>
+          <w:tcPr>
+            <w:tcW w:type="dxa" w:w="3135"/>
+          </w:tcPr>
+          <w:p>
+            <w:r>
+              <w:t>Expo</w:t>
+            </w:r>
+          </w:p>
+        </w:tc>
+        <w:tc>
+          <w:tcPr>
+            <w:tcW w:type="dxa" w:w="3135"/>
+          </w:tcPr>
+          <w:p>
+            <w:r>
+              <w:t>SDK 54</w:t>
             </w:r>
           </w:p>
         </w:tc>
@@ -2766,27 +3090,27 @@
           </w:tcPr>
           <w:p>
             <w:r>
-              <w:t>Orchestration</w:t>
-            </w:r>
-          </w:p>
-        </w:tc>
-        <w:tc>
-          <w:tcPr>
-            <w:tcW w:type="dxa" w:w="3135"/>
-          </w:tcPr>
-          <w:p>
-            <w:r>
-              <w:t>Docker Compose</w:t>
-            </w:r>
-          </w:p>
-        </w:tc>
-        <w:tc>
-          <w:tcPr>
-            <w:tcW w:type="dxa" w:w="3135"/>
-          </w:tcPr>
-          <w:p>
-            <w:r>
-              <w:t>Multi-service setup</w:t>
+              <w:t>UI Library</w:t>
+            </w:r>
+          </w:p>
+        </w:tc>
+        <w:tc>
+          <w:tcPr>
+            <w:tcW w:type="dxa" w:w="3135"/>
+          </w:tcPr>
+          <w:p>
+            <w:r>
+              <w:t>React Native</w:t>
+            </w:r>
+          </w:p>
+        </w:tc>
+        <w:tc>
+          <w:tcPr>
+            <w:tcW w:type="dxa" w:w="3135"/>
+          </w:tcPr>
+          <w:p>
+            <w:r>
+              <w:t>0.81</w:t>
             </w:r>
           </w:p>
         </w:tc>
@@ -2798,27 +3122,27 @@
           </w:tcPr>
           <w:p>
             <w:r>
-              <w:t>Reverse Proxy</w:t>
-            </w:r>
-          </w:p>
-        </w:tc>
-        <w:tc>
-          <w:tcPr>
-            <w:tcW w:type="dxa" w:w="3135"/>
-          </w:tcPr>
-          <w:p>
-            <w:r>
-              <w:t>Nginx</w:t>
-            </w:r>
-          </w:p>
-        </w:tc>
-        <w:tc>
-          <w:tcPr>
-            <w:tcW w:type="dxa" w:w="3135"/>
-          </w:tcPr>
-          <w:p>
-            <w:r>
-              <w:t>Alpine</w:t>
+              <w:t>Navigation</w:t>
+            </w:r>
+          </w:p>
+        </w:tc>
+        <w:tc>
+          <w:tcPr>
+            <w:tcW w:type="dxa" w:w="3135"/>
+          </w:tcPr>
+          <w:p>
+            <w:r>
+              <w:t>Expo Router</w:t>
+            </w:r>
+          </w:p>
+        </w:tc>
+        <w:tc>
+          <w:tcPr>
+            <w:tcW w:type="dxa" w:w="3135"/>
+          </w:tcPr>
+          <w:p>
+            <w:r>
+              <w:t>v6 (file-based routing)</w:t>
             </w:r>
           </w:p>
         </w:tc>
@@ -2830,27 +3154,27 @@
           </w:tcPr>
           <w:p>
             <w:r>
-              <w:t>Message Broker</w:t>
-            </w:r>
-          </w:p>
-        </w:tc>
-        <w:tc>
-          <w:tcPr>
-            <w:tcW w:type="dxa" w:w="3135"/>
-          </w:tcPr>
-          <w:p>
-            <w:r>
-              <w:t>Eclipse Mosquitto</w:t>
-            </w:r>
-          </w:p>
-        </w:tc>
-        <w:tc>
-          <w:tcPr>
-            <w:tcW w:type="dxa" w:w="3135"/>
-          </w:tcPr>
-          <w:p>
-            <w:r>
-              <w:t>2.x (MQTT)</w:t>
+              <w:t>Styling</w:t>
+            </w:r>
+          </w:p>
+        </w:tc>
+        <w:tc>
+          <w:tcPr>
+            <w:tcW w:type="dxa" w:w="3135"/>
+          </w:tcPr>
+          <w:p>
+            <w:r>
+              <w:t>NativeWind</w:t>
+            </w:r>
+          </w:p>
+        </w:tc>
+        <w:tc>
+          <w:tcPr>
+            <w:tcW w:type="dxa" w:w="3135"/>
+          </w:tcPr>
+          <w:p>
+            <w:r>
+              <w:t>v4 (Tailwind CSS for RN)</w:t>
             </w:r>
           </w:p>
         </w:tc>
@@ -2862,27 +3186,27 @@
           </w:tcPr>
           <w:p>
             <w:r>
-              <w:t>Hosting</w:t>
-            </w:r>
-          </w:p>
-        </w:tc>
-        <w:tc>
-          <w:tcPr>
-            <w:tcW w:type="dxa" w:w="3135"/>
-          </w:tcPr>
-          <w:p>
-            <w:r>
-              <w:t>Vercel / Self-hosted</w:t>
-            </w:r>
-          </w:p>
-        </w:tc>
-        <w:tc>
-          <w:tcPr>
-            <w:tcW w:type="dxa" w:w="3135"/>
-          </w:tcPr>
-          <w:p>
-            <w:r>
-              <w:t>Serverless + Docker</w:t>
+              <w:t>State Management</w:t>
+            </w:r>
+          </w:p>
+        </w:tc>
+        <w:tc>
+          <w:tcPr>
+            <w:tcW w:type="dxa" w:w="3135"/>
+          </w:tcPr>
+          <w:p>
+            <w:r>
+              <w:t>Zustand</w:t>
+            </w:r>
+          </w:p>
+        </w:tc>
+        <w:tc>
+          <w:tcPr>
+            <w:tcW w:type="dxa" w:w="3135"/>
+          </w:tcPr>
+          <w:p>
+            <w:r>
+              <w:t>5.x</w:t>
             </w:r>
           </w:p>
         </w:tc>
@@ -2894,27 +3218,123 @@
           </w:tcPr>
           <w:p>
             <w:r>
-              <w:t>CI/CD</w:t>
-            </w:r>
-          </w:p>
-        </w:tc>
-        <w:tc>
-          <w:tcPr>
-            <w:tcW w:type="dxa" w:w="3135"/>
-          </w:tcPr>
-          <w:p>
-            <w:r>
-              <w:t>Git-based deployment</w:t>
-            </w:r>
-          </w:p>
-        </w:tc>
-        <w:tc>
-          <w:tcPr>
-            <w:tcW w:type="dxa" w:w="3135"/>
-          </w:tcPr>
-          <w:p>
-            <w:r>
-              <w:t>Vercel auto-deploy</w:t>
+              <w:t>HTTP Client</w:t>
+            </w:r>
+          </w:p>
+        </w:tc>
+        <w:tc>
+          <w:tcPr>
+            <w:tcW w:type="dxa" w:w="3135"/>
+          </w:tcPr>
+          <w:p>
+            <w:r>
+              <w:t>Axios / Fetch</w:t>
+            </w:r>
+          </w:p>
+        </w:tc>
+        <w:tc>
+          <w:tcPr>
+            <w:tcW w:type="dxa" w:w="3135"/>
+          </w:tcPr>
+          <w:p>
+            <w:r>
+              <w:t>Bearer token auth</w:t>
+            </w:r>
+          </w:p>
+        </w:tc>
+      </w:tr>
+      <w:tr>
+        <w:tc>
+          <w:tcPr>
+            <w:tcW w:type="dxa" w:w="3135"/>
+          </w:tcPr>
+          <w:p>
+            <w:r>
+              <w:t>QR Scanner</w:t>
+            </w:r>
+          </w:p>
+        </w:tc>
+        <w:tc>
+          <w:tcPr>
+            <w:tcW w:type="dxa" w:w="3135"/>
+          </w:tcPr>
+          <w:p>
+            <w:r>
+              <w:t>expo-camera</w:t>
+            </w:r>
+          </w:p>
+        </w:tc>
+        <w:tc>
+          <w:tcPr>
+            <w:tcW w:type="dxa" w:w="3135"/>
+          </w:tcPr>
+          <w:p>
+            <w:r>
+              <w:t>QR code scanning</w:t>
+            </w:r>
+          </w:p>
+        </w:tc>
+      </w:tr>
+      <w:tr>
+        <w:tc>
+          <w:tcPr>
+            <w:tcW w:type="dxa" w:w="3135"/>
+          </w:tcPr>
+          <w:p>
+            <w:r>
+              <w:t>Secure Storage</w:t>
+            </w:r>
+          </w:p>
+        </w:tc>
+        <w:tc>
+          <w:tcPr>
+            <w:tcW w:type="dxa" w:w="3135"/>
+          </w:tcPr>
+          <w:p>
+            <w:r>
+              <w:t>expo-secure-store</w:t>
+            </w:r>
+          </w:p>
+        </w:tc>
+        <w:tc>
+          <w:tcPr>
+            <w:tcW w:type="dxa" w:w="3135"/>
+          </w:tcPr>
+          <w:p>
+            <w:r>
+              <w:t>Token persistence</w:t>
+            </w:r>
+          </w:p>
+        </w:tc>
+      </w:tr>
+      <w:tr>
+        <w:tc>
+          <w:tcPr>
+            <w:tcW w:type="dxa" w:w="3135"/>
+          </w:tcPr>
+          <w:p>
+            <w:r>
+              <w:t>Language</w:t>
+            </w:r>
+          </w:p>
+        </w:tc>
+        <w:tc>
+          <w:tcPr>
+            <w:tcW w:type="dxa" w:w="3135"/>
+          </w:tcPr>
+          <w:p>
+            <w:r>
+              <w:t>TypeScript</w:t>
+            </w:r>
+          </w:p>
+        </w:tc>
+        <w:tc>
+          <w:tcPr>
+            <w:tcW w:type="dxa" w:w="3135"/>
+          </w:tcPr>
+          <w:p>
+            <w:r>
+              <w:t>5.x</w:t>
             </w:r>
           </w:p>
         </w:tc>
@@ -2925,7 +3345,7 @@
         <w:pStyle w:val="Heading2"/>
       </w:pPr>
       <w:r>
-        <w:t>3.5 External Services &amp; Integrations</w:t>
+        <w:t>3.5 DevOps &amp; Infrastructure</w:t>
       </w:r>
     </w:p>
     <w:tbl>
@@ -2943,7 +3363,7 @@
         <w:tc>
           <w:tcPr>
             <w:tcW w:type="dxa" w:w="3135"/>
-            <w:shd w:fill="00695c"/>
+            <w:shd w:fill="e65100"/>
           </w:tcPr>
           <w:p>
             <w:r>
@@ -2958,7 +3378,7 @@
         <w:tc>
           <w:tcPr>
             <w:tcW w:type="dxa" w:w="3135"/>
-            <w:shd w:fill="00695c"/>
+            <w:shd w:fill="e65100"/>
           </w:tcPr>
           <w:p>
             <w:r>
@@ -2973,7 +3393,7 @@
         <w:tc>
           <w:tcPr>
             <w:tcW w:type="dxa" w:w="3135"/>
-            <w:shd w:fill="00695c"/>
+            <w:shd w:fill="e65100"/>
           </w:tcPr>
           <w:p>
             <w:r>
@@ -2993,27 +3413,27 @@
           </w:tcPr>
           <w:p>
             <w:r>
-              <w:t>Payment - India</w:t>
-            </w:r>
-          </w:p>
-        </w:tc>
-        <w:tc>
-          <w:tcPr>
-            <w:tcW w:type="dxa" w:w="3135"/>
-          </w:tcPr>
-          <w:p>
-            <w:r>
-              <w:t>Razorpay</w:t>
-            </w:r>
-          </w:p>
-        </w:tc>
-        <w:tc>
-          <w:tcPr>
-            <w:tcW w:type="dxa" w:w="3135"/>
-          </w:tcPr>
-          <w:p>
-            <w:r>
-              <w:t>Cards, UPI, Wallets</w:t>
+              <w:t>Containerization</w:t>
+            </w:r>
+          </w:p>
+        </w:tc>
+        <w:tc>
+          <w:tcPr>
+            <w:tcW w:type="dxa" w:w="3135"/>
+          </w:tcPr>
+          <w:p>
+            <w:r>
+              <w:t>Docker</w:t>
+            </w:r>
+          </w:p>
+        </w:tc>
+        <w:tc>
+          <w:tcPr>
+            <w:tcW w:type="dxa" w:w="3135"/>
+          </w:tcPr>
+          <w:p>
+            <w:r>
+              <w:t>Latest</w:t>
             </w:r>
           </w:p>
         </w:tc>
@@ -3025,27 +3445,27 @@
           </w:tcPr>
           <w:p>
             <w:r>
-              <w:t>Payment - Global</w:t>
-            </w:r>
-          </w:p>
-        </w:tc>
-        <w:tc>
-          <w:tcPr>
-            <w:tcW w:type="dxa" w:w="3135"/>
-          </w:tcPr>
-          <w:p>
-            <w:r>
-              <w:t>Stripe</w:t>
-            </w:r>
-          </w:p>
-        </w:tc>
-        <w:tc>
-          <w:tcPr>
-            <w:tcW w:type="dxa" w:w="3135"/>
-          </w:tcPr>
-          <w:p>
-            <w:r>
-              <w:t>Cards, Apple Pay, Google Pay</w:t>
+              <w:t>Orchestration</w:t>
+            </w:r>
+          </w:p>
+        </w:tc>
+        <w:tc>
+          <w:tcPr>
+            <w:tcW w:type="dxa" w:w="3135"/>
+          </w:tcPr>
+          <w:p>
+            <w:r>
+              <w:t>Docker Compose</w:t>
+            </w:r>
+          </w:p>
+        </w:tc>
+        <w:tc>
+          <w:tcPr>
+            <w:tcW w:type="dxa" w:w="3135"/>
+          </w:tcPr>
+          <w:p>
+            <w:r>
+              <w:t>Multi-service setup</w:t>
             </w:r>
           </w:p>
         </w:tc>
@@ -3057,27 +3477,27 @@
           </w:tcPr>
           <w:p>
             <w:r>
-              <w:t>Email</w:t>
-            </w:r>
-          </w:p>
-        </w:tc>
-        <w:tc>
-          <w:tcPr>
-            <w:tcW w:type="dxa" w:w="3135"/>
-          </w:tcPr>
-          <w:p>
-            <w:r>
-              <w:t>SMTP / Resend / SendGrid</w:t>
-            </w:r>
-          </w:p>
-        </w:tc>
-        <w:tc>
-          <w:tcPr>
-            <w:tcW w:type="dxa" w:w="3135"/>
-          </w:tcPr>
-          <w:p>
-            <w:r>
-              <w:t>Transactional emails</w:t>
+              <w:t>Reverse Proxy</w:t>
+            </w:r>
+          </w:p>
+        </w:tc>
+        <w:tc>
+          <w:tcPr>
+            <w:tcW w:type="dxa" w:w="3135"/>
+          </w:tcPr>
+          <w:p>
+            <w:r>
+              <w:t>Nginx</w:t>
+            </w:r>
+          </w:p>
+        </w:tc>
+        <w:tc>
+          <w:tcPr>
+            <w:tcW w:type="dxa" w:w="3135"/>
+          </w:tcPr>
+          <w:p>
+            <w:r>
+              <w:t>Alpine</w:t>
             </w:r>
           </w:p>
         </w:tc>
@@ -3089,27 +3509,27 @@
           </w:tcPr>
           <w:p>
             <w:r>
-              <w:t>SMS - India</w:t>
-            </w:r>
-          </w:p>
-        </w:tc>
-        <w:tc>
-          <w:tcPr>
-            <w:tcW w:type="dxa" w:w="3135"/>
-          </w:tcPr>
-          <w:p>
-            <w:r>
-              <w:t>MSG91</w:t>
-            </w:r>
-          </w:p>
-        </w:tc>
-        <w:tc>
-          <w:tcPr>
-            <w:tcW w:type="dxa" w:w="3135"/>
-          </w:tcPr>
-          <w:p>
-            <w:r>
-              <w:t>OTP, Notifications</w:t>
+              <w:t>Message Broker</w:t>
+            </w:r>
+          </w:p>
+        </w:tc>
+        <w:tc>
+          <w:tcPr>
+            <w:tcW w:type="dxa" w:w="3135"/>
+          </w:tcPr>
+          <w:p>
+            <w:r>
+              <w:t>Eclipse Mosquitto</w:t>
+            </w:r>
+          </w:p>
+        </w:tc>
+        <w:tc>
+          <w:tcPr>
+            <w:tcW w:type="dxa" w:w="3135"/>
+          </w:tcPr>
+          <w:p>
+            <w:r>
+              <w:t>2.x (MQTT)</w:t>
             </w:r>
           </w:p>
         </w:tc>
@@ -3121,27 +3541,27 @@
           </w:tcPr>
           <w:p>
             <w:r>
-              <w:t>SMS - Global</w:t>
-            </w:r>
-          </w:p>
-        </w:tc>
-        <w:tc>
-          <w:tcPr>
-            <w:tcW w:type="dxa" w:w="3135"/>
-          </w:tcPr>
-          <w:p>
-            <w:r>
-              <w:t>Twilio</w:t>
-            </w:r>
-          </w:p>
-        </w:tc>
-        <w:tc>
-          <w:tcPr>
-            <w:tcW w:type="dxa" w:w="3135"/>
-          </w:tcPr>
-          <w:p>
-            <w:r>
-              <w:t>SMS worldwide</w:t>
+              <w:t>Hosting</w:t>
+            </w:r>
+          </w:p>
+        </w:tc>
+        <w:tc>
+          <w:tcPr>
+            <w:tcW w:type="dxa" w:w="3135"/>
+          </w:tcPr>
+          <w:p>
+            <w:r>
+              <w:t>Vercel / Self-hosted</w:t>
+            </w:r>
+          </w:p>
+        </w:tc>
+        <w:tc>
+          <w:tcPr>
+            <w:tcW w:type="dxa" w:w="3135"/>
+          </w:tcPr>
+          <w:p>
+            <w:r>
+              <w:t>Serverless + Docker</w:t>
             </w:r>
           </w:p>
         </w:tc>
@@ -3153,6 +3573,265 @@
           </w:tcPr>
           <w:p>
             <w:r>
+              <w:t>CI/CD</w:t>
+            </w:r>
+          </w:p>
+        </w:tc>
+        <w:tc>
+          <w:tcPr>
+            <w:tcW w:type="dxa" w:w="3135"/>
+          </w:tcPr>
+          <w:p>
+            <w:r>
+              <w:t>Git-based deployment</w:t>
+            </w:r>
+          </w:p>
+        </w:tc>
+        <w:tc>
+          <w:tcPr>
+            <w:tcW w:type="dxa" w:w="3135"/>
+          </w:tcPr>
+          <w:p>
+            <w:r>
+              <w:t>Vercel auto-deploy</w:t>
+            </w:r>
+          </w:p>
+        </w:tc>
+      </w:tr>
+    </w:tbl>
+    <w:p>
+      <w:pPr>
+        <w:pStyle w:val="Heading2"/>
+      </w:pPr>
+      <w:r>
+        <w:t>3.6 External Services &amp; Integrations</w:t>
+      </w:r>
+    </w:p>
+    <w:tbl>
+      <w:tblPr>
+        <w:tblStyle w:val="TableGrid"/>
+        <w:tblW w:type="auto" w:w="0"/>
+        <w:tblLook w:firstColumn="1" w:firstRow="1" w:lastColumn="0" w:lastRow="0" w:noHBand="0" w:noVBand="1" w:val="04A0"/>
+      </w:tblPr>
+      <w:tblGrid>
+        <w:gridCol w:w="3135"/>
+        <w:gridCol w:w="3135"/>
+        <w:gridCol w:w="3135"/>
+      </w:tblGrid>
+      <w:tr>
+        <w:tc>
+          <w:tcPr>
+            <w:tcW w:type="dxa" w:w="3135"/>
+            <w:shd w:fill="00695c"/>
+          </w:tcPr>
+          <w:p>
+            <w:r>
+              <w:rPr>
+                <w:b/>
+                <w:color w:val="FFFFFF"/>
+              </w:rPr>
+              <w:t>Category</w:t>
+            </w:r>
+          </w:p>
+        </w:tc>
+        <w:tc>
+          <w:tcPr>
+            <w:tcW w:type="dxa" w:w="3135"/>
+            <w:shd w:fill="00695c"/>
+          </w:tcPr>
+          <w:p>
+            <w:r>
+              <w:rPr>
+                <w:b/>
+                <w:color w:val="FFFFFF"/>
+              </w:rPr>
+              <w:t>Technology</w:t>
+            </w:r>
+          </w:p>
+        </w:tc>
+        <w:tc>
+          <w:tcPr>
+            <w:tcW w:type="dxa" w:w="3135"/>
+            <w:shd w:fill="00695c"/>
+          </w:tcPr>
+          <w:p>
+            <w:r>
+              <w:rPr>
+                <w:b/>
+                <w:color w:val="FFFFFF"/>
+              </w:rPr>
+              <w:t>Version/Details</w:t>
+            </w:r>
+          </w:p>
+        </w:tc>
+      </w:tr>
+      <w:tr>
+        <w:tc>
+          <w:tcPr>
+            <w:tcW w:type="dxa" w:w="3135"/>
+          </w:tcPr>
+          <w:p>
+            <w:r>
+              <w:t>Payment - India</w:t>
+            </w:r>
+          </w:p>
+        </w:tc>
+        <w:tc>
+          <w:tcPr>
+            <w:tcW w:type="dxa" w:w="3135"/>
+          </w:tcPr>
+          <w:p>
+            <w:r>
+              <w:t>Razorpay</w:t>
+            </w:r>
+          </w:p>
+        </w:tc>
+        <w:tc>
+          <w:tcPr>
+            <w:tcW w:type="dxa" w:w="3135"/>
+          </w:tcPr>
+          <w:p>
+            <w:r>
+              <w:t>Cards, UPI, Wallets</w:t>
+            </w:r>
+          </w:p>
+        </w:tc>
+      </w:tr>
+      <w:tr>
+        <w:tc>
+          <w:tcPr>
+            <w:tcW w:type="dxa" w:w="3135"/>
+          </w:tcPr>
+          <w:p>
+            <w:r>
+              <w:t>Payment - Global</w:t>
+            </w:r>
+          </w:p>
+        </w:tc>
+        <w:tc>
+          <w:tcPr>
+            <w:tcW w:type="dxa" w:w="3135"/>
+          </w:tcPr>
+          <w:p>
+            <w:r>
+              <w:t>Stripe</w:t>
+            </w:r>
+          </w:p>
+        </w:tc>
+        <w:tc>
+          <w:tcPr>
+            <w:tcW w:type="dxa" w:w="3135"/>
+          </w:tcPr>
+          <w:p>
+            <w:r>
+              <w:t>Cards, Apple Pay, Google Pay</w:t>
+            </w:r>
+          </w:p>
+        </w:tc>
+      </w:tr>
+      <w:tr>
+        <w:tc>
+          <w:tcPr>
+            <w:tcW w:type="dxa" w:w="3135"/>
+          </w:tcPr>
+          <w:p>
+            <w:r>
+              <w:t>Email</w:t>
+            </w:r>
+          </w:p>
+        </w:tc>
+        <w:tc>
+          <w:tcPr>
+            <w:tcW w:type="dxa" w:w="3135"/>
+          </w:tcPr>
+          <w:p>
+            <w:r>
+              <w:t>SMTP / Resend / SendGrid</w:t>
+            </w:r>
+          </w:p>
+        </w:tc>
+        <w:tc>
+          <w:tcPr>
+            <w:tcW w:type="dxa" w:w="3135"/>
+          </w:tcPr>
+          <w:p>
+            <w:r>
+              <w:t>Transactional emails</w:t>
+            </w:r>
+          </w:p>
+        </w:tc>
+      </w:tr>
+      <w:tr>
+        <w:tc>
+          <w:tcPr>
+            <w:tcW w:type="dxa" w:w="3135"/>
+          </w:tcPr>
+          <w:p>
+            <w:r>
+              <w:t>SMS - India</w:t>
+            </w:r>
+          </w:p>
+        </w:tc>
+        <w:tc>
+          <w:tcPr>
+            <w:tcW w:type="dxa" w:w="3135"/>
+          </w:tcPr>
+          <w:p>
+            <w:r>
+              <w:t>MSG91</w:t>
+            </w:r>
+          </w:p>
+        </w:tc>
+        <w:tc>
+          <w:tcPr>
+            <w:tcW w:type="dxa" w:w="3135"/>
+          </w:tcPr>
+          <w:p>
+            <w:r>
+              <w:t>OTP, Notifications</w:t>
+            </w:r>
+          </w:p>
+        </w:tc>
+      </w:tr>
+      <w:tr>
+        <w:tc>
+          <w:tcPr>
+            <w:tcW w:type="dxa" w:w="3135"/>
+          </w:tcPr>
+          <w:p>
+            <w:r>
+              <w:t>SMS - Global</w:t>
+            </w:r>
+          </w:p>
+        </w:tc>
+        <w:tc>
+          <w:tcPr>
+            <w:tcW w:type="dxa" w:w="3135"/>
+          </w:tcPr>
+          <w:p>
+            <w:r>
+              <w:t>Twilio</w:t>
+            </w:r>
+          </w:p>
+        </w:tc>
+        <w:tc>
+          <w:tcPr>
+            <w:tcW w:type="dxa" w:w="3135"/>
+          </w:tcPr>
+          <w:p>
+            <w:r>
+              <w:t>SMS worldwide</w:t>
+            </w:r>
+          </w:p>
+        </w:tc>
+      </w:tr>
+      <w:tr>
+        <w:tc>
+          <w:tcPr>
+            <w:tcW w:type="dxa" w:w="3135"/>
+          </w:tcPr>
+          <w:p>
+            <w:r>
               <w:t>Storage</w:t>
             </w:r>
           </w:p>
@@ -3174,6 +3853,38 @@
           <w:p>
             <w:r>
               <w:t>File storage</w:t>
+            </w:r>
+          </w:p>
+        </w:tc>
+      </w:tr>
+      <w:tr>
+        <w:tc>
+          <w:tcPr>
+            <w:tcW w:type="dxa" w:w="3135"/>
+          </w:tcPr>
+          <w:p>
+            <w:r>
+              <w:t>SSO</w:t>
+            </w:r>
+          </w:p>
+        </w:tc>
+        <w:tc>
+          <w:tcPr>
+            <w:tcW w:type="dxa" w:w="3135"/>
+          </w:tcPr>
+          <w:p>
+            <w:r>
+              <w:t>Microsoft Azure AD / MSAL</w:t>
+            </w:r>
+          </w:p>
+        </w:tc>
+        <w:tc>
+          <w:tcPr>
+            <w:tcW w:type="dxa" w:w="3135"/>
+          </w:tcPr>
+          <w:p>
+            <w:r>
+              <w:t>Enterprise Single Sign-On</w:t>
             </w:r>
           </w:p>
         </w:tc>
@@ -3470,6 +4181,228 @@
       </w:r>
     </w:p>
     <w:p>
+      <w:pPr>
+        <w:pStyle w:val="Heading2"/>
+      </w:pPr>
+      <w:r>
+        <w:t>5.2 Intel OpenVINO Integration</w:t>
+      </w:r>
+    </w:p>
+    <w:p>
+      <w:pPr>
+        <w:spacing w:after="240"/>
+      </w:pPr>
+      <w:r>
+        <w:t>The AI pipeline leverages Intel OpenVINO™ toolkit for optimized deep learning inference, providing significant performance benefits across Intel hardware platforms. This integration enables real-time vehicle detection and license plate recognition with sub-100ms latency.</w:t>
+      </w:r>
+    </w:p>
+    <w:p>
+      <w:pPr>
+        <w:pStyle w:val="Heading3"/>
+      </w:pPr>
+      <w:r>
+        <w:t>Hardware Acceleration Configurations</w:t>
+      </w:r>
+    </w:p>
+    <w:p>
+      <w:pPr>
+        <w:pStyle w:val="ListBullet"/>
+      </w:pPr>
+      <w:r>
+        <w:rPr>
+          <w:b/>
+        </w:rPr>
+        <w:t xml:space="preserve">Intel GPU (Integrated/Discrete): </w:t>
+      </w:r>
+      <w:r>
+        <w:t>FP16 precision, 2 inference streams, 4 threads, batch size 4 - optimal for desktop/server deployments</w:t>
+      </w:r>
+    </w:p>
+    <w:p>
+      <w:pPr>
+        <w:pStyle w:val="ListBullet"/>
+      </w:pPr>
+      <w:r>
+        <w:rPr>
+          <w:b/>
+        </w:rPr>
+        <w:t xml:space="preserve">Intel NPU (Neural Processing Unit): </w:t>
+      </w:r>
+      <w:r>
+        <w:t>INT8 precision, single stream, batch size 1 - optimized for edge devices with dedicated AI accelerators</w:t>
+      </w:r>
+    </w:p>
+    <w:p>
+      <w:pPr>
+        <w:pStyle w:val="ListBullet"/>
+      </w:pPr>
+      <w:r>
+        <w:rPr>
+          <w:b/>
+        </w:rPr>
+        <w:t xml:space="preserve">Intel CPU (Optimized): </w:t>
+      </w:r>
+      <w:r>
+        <w:t>FP32 precision, 4 inference threads, batch size 1 - fallback for systems without GPU/NPU</w:t>
+      </w:r>
+    </w:p>
+    <w:p>
+      <w:pPr>
+        <w:pStyle w:val="ListBullet"/>
+      </w:pPr>
+      <w:r>
+        <w:rPr>
+          <w:b/>
+        </w:rPr>
+        <w:t xml:space="preserve">NVIDIA GPU (CUDA): </w:t>
+      </w:r>
+      <w:r>
+        <w:t>FP16 precision, 4 streams, batch size 8 - supported for mixed hardware environments</w:t>
+      </w:r>
+    </w:p>
+    <w:p>
+      <w:pPr>
+        <w:pStyle w:val="Heading3"/>
+      </w:pPr>
+      <w:r>
+        <w:t>Intel OpenVINO Features Used</w:t>
+      </w:r>
+    </w:p>
+    <w:p>
+      <w:pPr>
+        <w:pStyle w:val="ListBullet"/>
+      </w:pPr>
+      <w:r>
+        <w:rPr>
+          <w:b/>
+        </w:rPr>
+        <w:t xml:space="preserve">Model Optimization: </w:t>
+      </w:r>
+      <w:r>
+        <w:t>Automatic model conversion from YOLO/PyTorch to OpenVINO IR format with quantization support</w:t>
+      </w:r>
+    </w:p>
+    <w:p>
+      <w:pPr>
+        <w:pStyle w:val="ListBullet"/>
+      </w:pPr>
+      <w:r>
+        <w:rPr>
+          <w:b/>
+        </w:rPr>
+        <w:t xml:space="preserve">Async Inference: </w:t>
+      </w:r>
+      <w:r>
+        <w:t>Non-blocking inference API for parallel frame processing and improved throughput</w:t>
+      </w:r>
+    </w:p>
+    <w:p>
+      <w:pPr>
+        <w:pStyle w:val="ListBullet"/>
+      </w:pPr>
+      <w:r>
+        <w:rPr>
+          <w:b/>
+        </w:rPr>
+        <w:t xml:space="preserve">Auto Device Selection: </w:t>
+      </w:r>
+      <w:r>
+        <w:t>Automatic detection and selection of optimal hardware (GPU &gt; NPU &gt; CPU)</w:t>
+      </w:r>
+    </w:p>
+    <w:p>
+      <w:pPr>
+        <w:pStyle w:val="ListBullet"/>
+      </w:pPr>
+      <w:r>
+        <w:rPr>
+          <w:b/>
+        </w:rPr>
+        <w:t xml:space="preserve">Model Caching: </w:t>
+      </w:r>
+      <w:r>
+        <w:t>Compiled model caching for faster startup and reduced initialization time</w:t>
+      </w:r>
+    </w:p>
+    <w:p>
+      <w:pPr>
+        <w:pStyle w:val="ListBullet"/>
+      </w:pPr>
+      <w:r>
+        <w:rPr>
+          <w:b/>
+        </w:rPr>
+        <w:t xml:space="preserve">Dynamic Batching: </w:t>
+      </w:r>
+      <w:r>
+        <w:t>Adaptive batch processing based on system load and latency requirements</w:t>
+      </w:r>
+    </w:p>
+    <w:p>
+      <w:pPr>
+        <w:pStyle w:val="Heading3"/>
+      </w:pPr>
+      <w:r>
+        <w:t>Pre-trained Intel Models</w:t>
+      </w:r>
+    </w:p>
+    <w:p>
+      <w:pPr>
+        <w:pStyle w:val="ListBullet"/>
+      </w:pPr>
+      <w:r>
+        <w:rPr>
+          <w:b/>
+        </w:rPr>
+        <w:t xml:space="preserve">vehicle-attributes-recognition-barrier-0039: </w:t>
+      </w:r>
+      <w:r>
+        <w:t>Vehicle color and type classification (Intel Model Zoo)</w:t>
+      </w:r>
+    </w:p>
+    <w:p>
+      <w:pPr>
+        <w:pStyle w:val="ListBullet"/>
+      </w:pPr>
+      <w:r>
+        <w:rPr>
+          <w:b/>
+        </w:rPr>
+        <w:t xml:space="preserve">vehicle-license-plate-detection-barrier-0106: </w:t>
+      </w:r>
+      <w:r>
+        <w:t>License plate detection optimized for barrier cameras</w:t>
+      </w:r>
+    </w:p>
+    <w:p>
+      <w:pPr>
+        <w:pStyle w:val="ListBullet"/>
+      </w:pPr>
+      <w:r>
+        <w:rPr>
+          <w:b/>
+        </w:rPr>
+        <w:t xml:space="preserve">license-plate-recognition-barrier-0007: </w:t>
+      </w:r>
+      <w:r>
+        <w:t>OCR for license plate text recognition</w:t>
+      </w:r>
+    </w:p>
+    <w:p>
+      <w:pPr>
+        <w:pStyle w:val="ListBullet"/>
+      </w:pPr>
+      <w:r>
+        <w:rPr>
+          <w:b/>
+        </w:rPr>
+        <w:t xml:space="preserve">yolov10s-int8: </w:t>
+      </w:r>
+      <w:r>
+        <w:t>INT8 quantized YOLOv10 for efficient vehicle detection</w:t>
+      </w:r>
+    </w:p>
+    <w:p>
       <w:r>
         <w:br w:type="page"/>
       </w:r>
@@ -3679,7 +4612,7 @@
         <w:pStyle w:val="ListBullet"/>
       </w:pPr>
       <w:r>
-        <w:t>OpenVINO environment setup and configuration</w:t>
+        <w:t>Intel OpenVINO 2024.0+ environment setup and configuration</w:t>
       </w:r>
     </w:p>
     <w:p>
@@ -3687,7 +4620,7 @@
         <w:pStyle w:val="ListBullet"/>
       </w:pPr>
       <w:r>
-        <w:t>YOLOv8 model integration for vehicle detection</w:t>
+        <w:t>Intel GPU/NPU hardware detection and auto-configuration</w:t>
       </w:r>
     </w:p>
     <w:p>
@@ -3695,7 +4628,7 @@
         <w:pStyle w:val="ListBullet"/>
       </w:pPr>
       <w:r>
-        <w:t>License plate detection and recognition models</w:t>
+        <w:t>YOLOv8 model integration with OpenVINO export and optimization</w:t>
       </w:r>
     </w:p>
     <w:p>
@@ -3703,7 +4636,7 @@
         <w:pStyle w:val="ListBullet"/>
       </w:pPr>
       <w:r>
-        <w:t>Camera management with RTSP/ONVIF support</w:t>
+        <w:t>Intel Model Zoo integration (vehicle-attributes, license plate models)</w:t>
       </w:r>
     </w:p>
     <w:p>
@@ -3711,7 +4644,7 @@
         <w:pStyle w:val="ListBullet"/>
       </w:pPr>
       <w:r>
-        <w:t>Real-time video stream processing</w:t>
+        <w:t>License plate detection and OCR recognition pipeline</w:t>
       </w:r>
     </w:p>
     <w:p>
@@ -3719,7 +4652,7 @@
         <w:pStyle w:val="ListBullet"/>
       </w:pPr>
       <w:r>
-        <w:t>Detection event pipeline with MQTT</w:t>
+        <w:t>Camera management with RTSP/ONVIF support</w:t>
       </w:r>
     </w:p>
     <w:p>
@@ -3727,7 +4660,39 @@
         <w:pStyle w:val="ListBullet"/>
       </w:pPr>
       <w:r>
+        <w:t>Real-time video stream processing with frame skipping optimization</w:t>
+      </w:r>
+    </w:p>
+    <w:p>
+      <w:pPr>
+        <w:pStyle w:val="ListBullet"/>
+      </w:pPr>
+      <w:r>
+        <w:t>Async inference queue for parallel processing</w:t>
+      </w:r>
+    </w:p>
+    <w:p>
+      <w:pPr>
+        <w:pStyle w:val="ListBullet"/>
+      </w:pPr>
+      <w:r>
+        <w:t>Detection event pipeline with MQTT</w:t>
+      </w:r>
+    </w:p>
+    <w:p>
+      <w:pPr>
+        <w:pStyle w:val="ListBullet"/>
+      </w:pPr>
+      <w:r>
         <w:t>Occupancy detection with confidence scoring</w:t>
+      </w:r>
+    </w:p>
+    <w:p>
+      <w:pPr>
+        <w:pStyle w:val="ListBullet"/>
+      </w:pPr>
+      <w:r>
+        <w:t>Latency profiling and optimization (&lt;100ms target)</w:t>
       </w:r>
     </w:p>
     <w:p>
@@ -4160,6 +5125,118 @@
       </w:pPr>
       <w:r>
         <w:t>Go-live support and stabilization</w:t>
+      </w:r>
+    </w:p>
+    <w:p>
+      <w:pPr>
+        <w:pStyle w:val="Heading2"/>
+      </w:pPr>
+      <w:r>
+        <w:t>Phase 9: Mobile Application</w:t>
+      </w:r>
+    </w:p>
+    <w:p>
+      <w:r>
+        <w:rPr>
+          <w:b/>
+        </w:rPr>
+        <w:t>Duration: 4 Weeks</w:t>
+      </w:r>
+    </w:p>
+    <w:p>
+      <w:r>
+        <w:rPr>
+          <w:b/>
+        </w:rPr>
+        <w:t>Deliverables:</w:t>
+      </w:r>
+    </w:p>
+    <w:p>
+      <w:pPr>
+        <w:pStyle w:val="ListBullet"/>
+      </w:pPr>
+      <w:r>
+        <w:t>Expo/React Native project setup with SDK 54</w:t>
+      </w:r>
+    </w:p>
+    <w:p>
+      <w:pPr>
+        <w:pStyle w:val="ListBullet"/>
+      </w:pPr>
+      <w:r>
+        <w:t>Mobile authentication (login, register, token refresh)</w:t>
+      </w:r>
+    </w:p>
+    <w:p>
+      <w:pPr>
+        <w:pStyle w:val="ListBullet"/>
+      </w:pPr>
+      <w:r>
+        <w:t>Vehicle management (CRUD operations)</w:t>
+      </w:r>
+    </w:p>
+    <w:p>
+      <w:pPr>
+        <w:pStyle w:val="ListBullet"/>
+      </w:pPr>
+      <w:r>
+        <w:t>Parking lot discovery with real-time availability</w:t>
+      </w:r>
+    </w:p>
+    <w:p>
+      <w:pPr>
+        <w:pStyle w:val="ListBullet"/>
+      </w:pPr>
+      <w:r>
+        <w:t>Session management (create, view, exit)</w:t>
+      </w:r>
+    </w:p>
+    <w:p>
+      <w:pPr>
+        <w:pStyle w:val="ListBullet"/>
+      </w:pPr>
+      <w:r>
+        <w:t>Mobile wallet integration (balance, deposits, transactions)</w:t>
+      </w:r>
+    </w:p>
+    <w:p>
+      <w:pPr>
+        <w:pStyle w:val="ListBullet"/>
+      </w:pPr>
+      <w:r>
+        <w:t>QR code scanning for entry/exit validation</w:t>
+      </w:r>
+    </w:p>
+    <w:p>
+      <w:pPr>
+        <w:pStyle w:val="ListBullet"/>
+      </w:pPr>
+      <w:r>
+        <w:t>Push notification integration</w:t>
+      </w:r>
+    </w:p>
+    <w:p>
+      <w:pPr>
+        <w:pStyle w:val="ListBullet"/>
+      </w:pPr>
+      <w:r>
+        <w:t>Dark theme UI with NativeWind</w:t>
+      </w:r>
+    </w:p>
+    <w:p>
+      <w:pPr>
+        <w:pStyle w:val="ListBullet"/>
+      </w:pPr>
+      <w:r>
+        <w:t>Mobile-specific API endpoints (/api/mobile/*)</w:t>
+      </w:r>
+    </w:p>
+    <w:p>
+      <w:pPr>
+        <w:pStyle w:val="ListBullet"/>
+      </w:pPr>
+      <w:r>
+        <w:t>Cross-platform testing (iOS and Android)</w:t>
       </w:r>
     </w:p>
     <w:p>
@@ -4432,6 +5509,48 @@
           </w:tcPr>
           <w:p>
             <w:r>
+              <w:t>Mobile Developer</w:t>
+            </w:r>
+          </w:p>
+        </w:tc>
+        <w:tc>
+          <w:tcPr>
+            <w:tcW w:type="dxa" w:w="2351"/>
+          </w:tcPr>
+          <w:p>
+            <w:r>
+              <w:t>1</w:t>
+            </w:r>
+          </w:p>
+        </w:tc>
+        <w:tc>
+          <w:tcPr>
+            <w:tcW w:type="dxa" w:w="2351"/>
+          </w:tcPr>
+          <w:p>
+            <w:r>
+              <w:t>3+ years</w:t>
+            </w:r>
+          </w:p>
+        </w:tc>
+        <w:tc>
+          <w:tcPr>
+            <w:tcW w:type="dxa" w:w="2351"/>
+          </w:tcPr>
+          <w:p>
+            <w:r>
+              <w:t>React Native/Expo mobile app development, iOS/Android</w:t>
+            </w:r>
+          </w:p>
+        </w:tc>
+      </w:tr>
+      <w:tr>
+        <w:tc>
+          <w:tcPr>
+            <w:tcW w:type="dxa" w:w="2351"/>
+          </w:tcPr>
+          <w:p>
+            <w:r>
               <w:t>AI/ML Engineer</w:t>
             </w:r>
           </w:p>
@@ -4462,7 +5581,7 @@
           </w:tcPr>
           <w:p>
             <w:r>
-              <w:t>OpenVINO integration, model optimization, detection pipeline</w:t>
+              <w:t>Intel OpenVINO integration, GPU/NPU optimization, detection pipeline</w:t>
             </w:r>
           </w:p>
         </w:tc>
@@ -4731,6 +5850,38 @@
           </w:tcPr>
           <w:p>
             <w:r>
+              <w:t>Mobile</w:t>
+            </w:r>
+          </w:p>
+        </w:tc>
+        <w:tc>
+          <w:tcPr>
+            <w:tcW w:type="dxa" w:w="3135"/>
+          </w:tcPr>
+          <w:p>
+            <w:r>
+              <w:t>React Native, Expo, TypeScript</w:t>
+            </w:r>
+          </w:p>
+        </w:tc>
+        <w:tc>
+          <w:tcPr>
+            <w:tcW w:type="dxa" w:w="3135"/>
+          </w:tcPr>
+          <w:p>
+            <w:r>
+              <w:t>NativeWind, Expo Router, Zustand</w:t>
+            </w:r>
+          </w:p>
+        </w:tc>
+      </w:tr>
+      <w:tr>
+        <w:tc>
+          <w:tcPr>
+            <w:tcW w:type="dxa" w:w="3135"/>
+          </w:tcPr>
+          <w:p>
+            <w:r>
               <w:t>AI/ML</w:t>
             </w:r>
           </w:p>
@@ -4741,17 +5892,49 @@
           </w:tcPr>
           <w:p>
             <w:r>
-              <w:t>Python, OpenCV, Deep Learning</w:t>
-            </w:r>
-          </w:p>
-        </w:tc>
-        <w:tc>
-          <w:tcPr>
-            <w:tcW w:type="dxa" w:w="3135"/>
-          </w:tcPr>
-          <w:p>
-            <w:r>
-              <w:t>OpenVINO, YOLO, MQTT</w:t>
+              <w:t>Python, OpenCV, Deep Learning, Intel OpenVINO</w:t>
+            </w:r>
+          </w:p>
+        </w:tc>
+        <w:tc>
+          <w:tcPr>
+            <w:tcW w:type="dxa" w:w="3135"/>
+          </w:tcPr>
+          <w:p>
+            <w:r>
+              <w:t>YOLO, Model optimization, MQTT</w:t>
+            </w:r>
+          </w:p>
+        </w:tc>
+      </w:tr>
+      <w:tr>
+        <w:tc>
+          <w:tcPr>
+            <w:tcW w:type="dxa" w:w="3135"/>
+          </w:tcPr>
+          <w:p>
+            <w:r>
+              <w:t>Intel AI</w:t>
+            </w:r>
+          </w:p>
+        </w:tc>
+        <w:tc>
+          <w:tcPr>
+            <w:tcW w:type="dxa" w:w="3135"/>
+          </w:tcPr>
+          <w:p>
+            <w:r>
+              <w:t>OpenVINO Runtime, Model conversion</w:t>
+            </w:r>
+          </w:p>
+        </w:tc>
+        <w:tc>
+          <w:tcPr>
+            <w:tcW w:type="dxa" w:w="3135"/>
+          </w:tcPr>
+          <w:p>
+            <w:r>
+              <w:t>Intel GPU/NPU optimization, INT8 quantization</w:t>
             </w:r>
           </w:p>
         </w:tc>
@@ -4866,7 +6049,7 @@
         <w:rPr>
           <w:b/>
         </w:rPr>
-        <w:t>Total Team Size: 10 members</w:t>
+        <w:t>Total Team Size: 11 members</w:t>
       </w:r>
     </w:p>
     <w:p>
@@ -4938,7 +6121,7 @@
         <w:rPr>
           <w:b/>
         </w:rPr>
-        <w:t>Total Project Duration: 31 Weeks (~8 Months)</w:t>
+        <w:t>Total Project Duration: 35 Weeks (~9 Months)</w:t>
       </w:r>
     </w:p>
     <w:tbl>
@@ -5351,6 +6534,48 @@
           </w:p>
         </w:tc>
       </w:tr>
+      <w:tr>
+        <w:tc>
+          <w:tcPr>
+            <w:tcW w:type="dxa" w:w="2351"/>
+          </w:tcPr>
+          <w:p>
+            <w:r>
+              <w:t>Phase 9</w:t>
+            </w:r>
+          </w:p>
+        </w:tc>
+        <w:tc>
+          <w:tcPr>
+            <w:tcW w:type="dxa" w:w="2351"/>
+          </w:tcPr>
+          <w:p>
+            <w:r>
+              <w:t>Mobile Application</w:t>
+            </w:r>
+          </w:p>
+        </w:tc>
+        <w:tc>
+          <w:tcPr>
+            <w:tcW w:type="dxa" w:w="2351"/>
+          </w:tcPr>
+          <w:p>
+            <w:r>
+              <w:t>4 weeks</w:t>
+            </w:r>
+          </w:p>
+        </w:tc>
+        <w:tc>
+          <w:tcPr>
+            <w:tcW w:type="dxa" w:w="2351"/>
+          </w:tcPr>
+          <w:p>
+            <w:r>
+              <w:t>Week 32-35</w:t>
+            </w:r>
+          </w:p>
+        </w:tc>
+      </w:tr>
     </w:tbl>
     <w:p>
       <w:pPr>
@@ -5674,6 +6899,38 @@
           </w:p>
         </w:tc>
       </w:tr>
+      <w:tr>
+        <w:tc>
+          <w:tcPr>
+            <w:tcW w:type="dxa" w:w="3135"/>
+          </w:tcPr>
+          <w:p>
+            <w:r>
+              <w:t>M9: Mobile App Release</w:t>
+            </w:r>
+          </w:p>
+        </w:tc>
+        <w:tc>
+          <w:tcPr>
+            <w:tcW w:type="dxa" w:w="3135"/>
+          </w:tcPr>
+          <w:p>
+            <w:r>
+              <w:t>Week 35</w:t>
+            </w:r>
+          </w:p>
+        </w:tc>
+        <w:tc>
+          <w:tcPr>
+            <w:tcW w:type="dxa" w:w="3135"/>
+          </w:tcPr>
+          <w:p>
+            <w:r>
+              <w:t>iOS and Android apps published</w:t>
+            </w:r>
+          </w:p>
+        </w:tc>
+      </w:tr>
     </w:tbl>
     <w:p>
       <w:r>
@@ -5701,7 +6958,7 @@
         <w:spacing w:after="240"/>
       </w:pPr>
       <w:r>
-        <w:t>SPARKING provides a comprehensive RESTful API with 60+ endpoints organized by domain. All endpoints follow consistent patterns and return JSON responses.</w:t>
+        <w:t>SPARKING provides a comprehensive RESTful API with 89+ endpoints organized by domain, including dedicated mobile APIs. All endpoints follow consistent patterns and return JSON responses.</w:t>
       </w:r>
     </w:p>
     <w:p>
@@ -5921,6 +7178,48 @@
           </w:tcPr>
           <w:p>
             <w:r>
+              <w:t>POST</w:t>
+            </w:r>
+          </w:p>
+        </w:tc>
+        <w:tc>
+          <w:tcPr>
+            <w:tcW w:type="dxa" w:w="2351"/>
+          </w:tcPr>
+          <w:p>
+            <w:r>
+              <w:t>/api/auth/microsoft</w:t>
+            </w:r>
+          </w:p>
+        </w:tc>
+        <w:tc>
+          <w:tcPr>
+            <w:tcW w:type="dxa" w:w="2351"/>
+          </w:tcPr>
+          <w:p>
+            <w:r>
+              <w:t>Microsoft SSO callback</w:t>
+            </w:r>
+          </w:p>
+        </w:tc>
+        <w:tc>
+          <w:tcPr>
+            <w:tcW w:type="dxa" w:w="2351"/>
+          </w:tcPr>
+          <w:p>
+            <w:r>
+              <w:t>No</w:t>
+            </w:r>
+          </w:p>
+        </w:tc>
+      </w:tr>
+      <w:tr>
+        <w:tc>
+          <w:tcPr>
+            <w:tcW w:type="dxa" w:w="2351"/>
+          </w:tcPr>
+          <w:p>
+            <w:r>
               <w:t>GET</w:t>
             </w:r>
           </w:p>
@@ -7591,6 +8890,1013 @@
       </w:tr>
     </w:tbl>
     <w:p>
+      <w:pPr>
+        <w:pStyle w:val="Heading2"/>
+      </w:pPr>
+      <w:r>
+        <w:t>9.8 Mobile APIs</w:t>
+      </w:r>
+    </w:p>
+    <w:tbl>
+      <w:tblPr>
+        <w:tblStyle w:val="TableGrid"/>
+        <w:tblW w:type="auto" w:w="0"/>
+        <w:tblLook w:firstColumn="1" w:firstRow="1" w:lastColumn="0" w:lastRow="0" w:noHBand="0" w:noVBand="1" w:val="04A0"/>
+      </w:tblPr>
+      <w:tblGrid>
+        <w:gridCol w:w="2351"/>
+        <w:gridCol w:w="2351"/>
+        <w:gridCol w:w="2351"/>
+        <w:gridCol w:w="2351"/>
+      </w:tblGrid>
+      <w:tr>
+        <w:tc>
+          <w:tcPr>
+            <w:tcW w:type="dxa" w:w="2351"/>
+            <w:shd w:fill="00838f"/>
+          </w:tcPr>
+          <w:p>
+            <w:r>
+              <w:rPr>
+                <w:b/>
+                <w:color w:val="FFFFFF"/>
+              </w:rPr>
+              <w:t>Method</w:t>
+            </w:r>
+          </w:p>
+        </w:tc>
+        <w:tc>
+          <w:tcPr>
+            <w:tcW w:type="dxa" w:w="2351"/>
+            <w:shd w:fill="00838f"/>
+          </w:tcPr>
+          <w:p>
+            <w:r>
+              <w:rPr>
+                <w:b/>
+                <w:color w:val="FFFFFF"/>
+              </w:rPr>
+              <w:t>Endpoint</w:t>
+            </w:r>
+          </w:p>
+        </w:tc>
+        <w:tc>
+          <w:tcPr>
+            <w:tcW w:type="dxa" w:w="2351"/>
+            <w:shd w:fill="00838f"/>
+          </w:tcPr>
+          <w:p>
+            <w:r>
+              <w:rPr>
+                <w:b/>
+                <w:color w:val="FFFFFF"/>
+              </w:rPr>
+              <w:t>Description</w:t>
+            </w:r>
+          </w:p>
+        </w:tc>
+        <w:tc>
+          <w:tcPr>
+            <w:tcW w:type="dxa" w:w="2351"/>
+            <w:shd w:fill="00838f"/>
+          </w:tcPr>
+          <w:p>
+            <w:r>
+              <w:rPr>
+                <w:b/>
+                <w:color w:val="FFFFFF"/>
+              </w:rPr>
+              <w:t>Auth Required</w:t>
+            </w:r>
+          </w:p>
+        </w:tc>
+      </w:tr>
+      <w:tr>
+        <w:tc>
+          <w:tcPr>
+            <w:tcW w:type="dxa" w:w="2351"/>
+          </w:tcPr>
+          <w:p>
+            <w:r>
+              <w:t>POST</w:t>
+            </w:r>
+          </w:p>
+        </w:tc>
+        <w:tc>
+          <w:tcPr>
+            <w:tcW w:type="dxa" w:w="2351"/>
+          </w:tcPr>
+          <w:p>
+            <w:r>
+              <w:t>/api/mobile/auth/login</w:t>
+            </w:r>
+          </w:p>
+        </w:tc>
+        <w:tc>
+          <w:tcPr>
+            <w:tcW w:type="dxa" w:w="2351"/>
+          </w:tcPr>
+          <w:p>
+            <w:r>
+              <w:t>Mobile login</w:t>
+            </w:r>
+          </w:p>
+        </w:tc>
+        <w:tc>
+          <w:tcPr>
+            <w:tcW w:type="dxa" w:w="2351"/>
+          </w:tcPr>
+          <w:p>
+            <w:r>
+              <w:t>No</w:t>
+            </w:r>
+          </w:p>
+        </w:tc>
+      </w:tr>
+      <w:tr>
+        <w:tc>
+          <w:tcPr>
+            <w:tcW w:type="dxa" w:w="2351"/>
+          </w:tcPr>
+          <w:p>
+            <w:r>
+              <w:t>POST</w:t>
+            </w:r>
+          </w:p>
+        </w:tc>
+        <w:tc>
+          <w:tcPr>
+            <w:tcW w:type="dxa" w:w="2351"/>
+          </w:tcPr>
+          <w:p>
+            <w:r>
+              <w:t>/api/mobile/auth/register</w:t>
+            </w:r>
+          </w:p>
+        </w:tc>
+        <w:tc>
+          <w:tcPr>
+            <w:tcW w:type="dxa" w:w="2351"/>
+          </w:tcPr>
+          <w:p>
+            <w:r>
+              <w:t>Mobile registration</w:t>
+            </w:r>
+          </w:p>
+        </w:tc>
+        <w:tc>
+          <w:tcPr>
+            <w:tcW w:type="dxa" w:w="2351"/>
+          </w:tcPr>
+          <w:p>
+            <w:r>
+              <w:t>No</w:t>
+            </w:r>
+          </w:p>
+        </w:tc>
+      </w:tr>
+      <w:tr>
+        <w:tc>
+          <w:tcPr>
+            <w:tcW w:type="dxa" w:w="2351"/>
+          </w:tcPr>
+          <w:p>
+            <w:r>
+              <w:t>POST</w:t>
+            </w:r>
+          </w:p>
+        </w:tc>
+        <w:tc>
+          <w:tcPr>
+            <w:tcW w:type="dxa" w:w="2351"/>
+          </w:tcPr>
+          <w:p>
+            <w:r>
+              <w:t>/api/mobile/auth/logout</w:t>
+            </w:r>
+          </w:p>
+        </w:tc>
+        <w:tc>
+          <w:tcPr>
+            <w:tcW w:type="dxa" w:w="2351"/>
+          </w:tcPr>
+          <w:p>
+            <w:r>
+              <w:t>Mobile logout</w:t>
+            </w:r>
+          </w:p>
+        </w:tc>
+        <w:tc>
+          <w:tcPr>
+            <w:tcW w:type="dxa" w:w="2351"/>
+          </w:tcPr>
+          <w:p>
+            <w:r>
+              <w:t>Bearer</w:t>
+            </w:r>
+          </w:p>
+        </w:tc>
+      </w:tr>
+      <w:tr>
+        <w:tc>
+          <w:tcPr>
+            <w:tcW w:type="dxa" w:w="2351"/>
+          </w:tcPr>
+          <w:p>
+            <w:r>
+              <w:t>POST</w:t>
+            </w:r>
+          </w:p>
+        </w:tc>
+        <w:tc>
+          <w:tcPr>
+            <w:tcW w:type="dxa" w:w="2351"/>
+          </w:tcPr>
+          <w:p>
+            <w:r>
+              <w:t>/api/mobile/auth/refresh</w:t>
+            </w:r>
+          </w:p>
+        </w:tc>
+        <w:tc>
+          <w:tcPr>
+            <w:tcW w:type="dxa" w:w="2351"/>
+          </w:tcPr>
+          <w:p>
+            <w:r>
+              <w:t>Token refresh</w:t>
+            </w:r>
+          </w:p>
+        </w:tc>
+        <w:tc>
+          <w:tcPr>
+            <w:tcW w:type="dxa" w:w="2351"/>
+          </w:tcPr>
+          <w:p>
+            <w:r>
+              <w:t>Bearer</w:t>
+            </w:r>
+          </w:p>
+        </w:tc>
+      </w:tr>
+      <w:tr>
+        <w:tc>
+          <w:tcPr>
+            <w:tcW w:type="dxa" w:w="2351"/>
+          </w:tcPr>
+          <w:p>
+            <w:r>
+              <w:t>GET</w:t>
+            </w:r>
+          </w:p>
+        </w:tc>
+        <w:tc>
+          <w:tcPr>
+            <w:tcW w:type="dxa" w:w="2351"/>
+          </w:tcPr>
+          <w:p>
+            <w:r>
+              <w:t>/api/mobile/vehicles</w:t>
+            </w:r>
+          </w:p>
+        </w:tc>
+        <w:tc>
+          <w:tcPr>
+            <w:tcW w:type="dxa" w:w="2351"/>
+          </w:tcPr>
+          <w:p>
+            <w:r>
+              <w:t>List user vehicles</w:t>
+            </w:r>
+          </w:p>
+        </w:tc>
+        <w:tc>
+          <w:tcPr>
+            <w:tcW w:type="dxa" w:w="2351"/>
+          </w:tcPr>
+          <w:p>
+            <w:r>
+              <w:t>Bearer</w:t>
+            </w:r>
+          </w:p>
+        </w:tc>
+      </w:tr>
+      <w:tr>
+        <w:tc>
+          <w:tcPr>
+            <w:tcW w:type="dxa" w:w="2351"/>
+          </w:tcPr>
+          <w:p>
+            <w:r>
+              <w:t>POST</w:t>
+            </w:r>
+          </w:p>
+        </w:tc>
+        <w:tc>
+          <w:tcPr>
+            <w:tcW w:type="dxa" w:w="2351"/>
+          </w:tcPr>
+          <w:p>
+            <w:r>
+              <w:t>/api/mobile/vehicles</w:t>
+            </w:r>
+          </w:p>
+        </w:tc>
+        <w:tc>
+          <w:tcPr>
+            <w:tcW w:type="dxa" w:w="2351"/>
+          </w:tcPr>
+          <w:p>
+            <w:r>
+              <w:t>Add vehicle</w:t>
+            </w:r>
+          </w:p>
+        </w:tc>
+        <w:tc>
+          <w:tcPr>
+            <w:tcW w:type="dxa" w:w="2351"/>
+          </w:tcPr>
+          <w:p>
+            <w:r>
+              <w:t>Bearer</w:t>
+            </w:r>
+          </w:p>
+        </w:tc>
+      </w:tr>
+      <w:tr>
+        <w:tc>
+          <w:tcPr>
+            <w:tcW w:type="dxa" w:w="2351"/>
+          </w:tcPr>
+          <w:p>
+            <w:r>
+              <w:t>GET</w:t>
+            </w:r>
+          </w:p>
+        </w:tc>
+        <w:tc>
+          <w:tcPr>
+            <w:tcW w:type="dxa" w:w="2351"/>
+          </w:tcPr>
+          <w:p>
+            <w:r>
+              <w:t>/api/mobile/vehicles/{id}</w:t>
+            </w:r>
+          </w:p>
+        </w:tc>
+        <w:tc>
+          <w:tcPr>
+            <w:tcW w:type="dxa" w:w="2351"/>
+          </w:tcPr>
+          <w:p>
+            <w:r>
+              <w:t>Get vehicle</w:t>
+            </w:r>
+          </w:p>
+        </w:tc>
+        <w:tc>
+          <w:tcPr>
+            <w:tcW w:type="dxa" w:w="2351"/>
+          </w:tcPr>
+          <w:p>
+            <w:r>
+              <w:t>Bearer</w:t>
+            </w:r>
+          </w:p>
+        </w:tc>
+      </w:tr>
+      <w:tr>
+        <w:tc>
+          <w:tcPr>
+            <w:tcW w:type="dxa" w:w="2351"/>
+          </w:tcPr>
+          <w:p>
+            <w:r>
+              <w:t>PATCH</w:t>
+            </w:r>
+          </w:p>
+        </w:tc>
+        <w:tc>
+          <w:tcPr>
+            <w:tcW w:type="dxa" w:w="2351"/>
+          </w:tcPr>
+          <w:p>
+            <w:r>
+              <w:t>/api/mobile/vehicles/{id}</w:t>
+            </w:r>
+          </w:p>
+        </w:tc>
+        <w:tc>
+          <w:tcPr>
+            <w:tcW w:type="dxa" w:w="2351"/>
+          </w:tcPr>
+          <w:p>
+            <w:r>
+              <w:t>Update vehicle</w:t>
+            </w:r>
+          </w:p>
+        </w:tc>
+        <w:tc>
+          <w:tcPr>
+            <w:tcW w:type="dxa" w:w="2351"/>
+          </w:tcPr>
+          <w:p>
+            <w:r>
+              <w:t>Bearer</w:t>
+            </w:r>
+          </w:p>
+        </w:tc>
+      </w:tr>
+      <w:tr>
+        <w:tc>
+          <w:tcPr>
+            <w:tcW w:type="dxa" w:w="2351"/>
+          </w:tcPr>
+          <w:p>
+            <w:r>
+              <w:t>DELETE</w:t>
+            </w:r>
+          </w:p>
+        </w:tc>
+        <w:tc>
+          <w:tcPr>
+            <w:tcW w:type="dxa" w:w="2351"/>
+          </w:tcPr>
+          <w:p>
+            <w:r>
+              <w:t>/api/mobile/vehicles/{id}</w:t>
+            </w:r>
+          </w:p>
+        </w:tc>
+        <w:tc>
+          <w:tcPr>
+            <w:tcW w:type="dxa" w:w="2351"/>
+          </w:tcPr>
+          <w:p>
+            <w:r>
+              <w:t>Delete vehicle</w:t>
+            </w:r>
+          </w:p>
+        </w:tc>
+        <w:tc>
+          <w:tcPr>
+            <w:tcW w:type="dxa" w:w="2351"/>
+          </w:tcPr>
+          <w:p>
+            <w:r>
+              <w:t>Bearer</w:t>
+            </w:r>
+          </w:p>
+        </w:tc>
+      </w:tr>
+      <w:tr>
+        <w:tc>
+          <w:tcPr>
+            <w:tcW w:type="dxa" w:w="2351"/>
+          </w:tcPr>
+          <w:p>
+            <w:r>
+              <w:t>GET</w:t>
+            </w:r>
+          </w:p>
+        </w:tc>
+        <w:tc>
+          <w:tcPr>
+            <w:tcW w:type="dxa" w:w="2351"/>
+          </w:tcPr>
+          <w:p>
+            <w:r>
+              <w:t>/api/mobile/parking-lots</w:t>
+            </w:r>
+          </w:p>
+        </w:tc>
+        <w:tc>
+          <w:tcPr>
+            <w:tcW w:type="dxa" w:w="2351"/>
+          </w:tcPr>
+          <w:p>
+            <w:r>
+              <w:t>Available lots</w:t>
+            </w:r>
+          </w:p>
+        </w:tc>
+        <w:tc>
+          <w:tcPr>
+            <w:tcW w:type="dxa" w:w="2351"/>
+          </w:tcPr>
+          <w:p>
+            <w:r>
+              <w:t>Bearer</w:t>
+            </w:r>
+          </w:p>
+        </w:tc>
+      </w:tr>
+      <w:tr>
+        <w:tc>
+          <w:tcPr>
+            <w:tcW w:type="dxa" w:w="2351"/>
+          </w:tcPr>
+          <w:p>
+            <w:r>
+              <w:t>GET</w:t>
+            </w:r>
+          </w:p>
+        </w:tc>
+        <w:tc>
+          <w:tcPr>
+            <w:tcW w:type="dxa" w:w="2351"/>
+          </w:tcPr>
+          <w:p>
+            <w:r>
+              <w:t>/api/mobile/parking-lots/{id}</w:t>
+            </w:r>
+          </w:p>
+        </w:tc>
+        <w:tc>
+          <w:tcPr>
+            <w:tcW w:type="dxa" w:w="2351"/>
+          </w:tcPr>
+          <w:p>
+            <w:r>
+              <w:t>Lot details</w:t>
+            </w:r>
+          </w:p>
+        </w:tc>
+        <w:tc>
+          <w:tcPr>
+            <w:tcW w:type="dxa" w:w="2351"/>
+          </w:tcPr>
+          <w:p>
+            <w:r>
+              <w:t>Bearer</w:t>
+            </w:r>
+          </w:p>
+        </w:tc>
+      </w:tr>
+      <w:tr>
+        <w:tc>
+          <w:tcPr>
+            <w:tcW w:type="dxa" w:w="2351"/>
+          </w:tcPr>
+          <w:p>
+            <w:r>
+              <w:t>GET</w:t>
+            </w:r>
+          </w:p>
+        </w:tc>
+        <w:tc>
+          <w:tcPr>
+            <w:tcW w:type="dxa" w:w="2351"/>
+          </w:tcPr>
+          <w:p>
+            <w:r>
+              <w:t>/api/mobile/sessions</w:t>
+            </w:r>
+          </w:p>
+        </w:tc>
+        <w:tc>
+          <w:tcPr>
+            <w:tcW w:type="dxa" w:w="2351"/>
+          </w:tcPr>
+          <w:p>
+            <w:r>
+              <w:t>Parking sessions</w:t>
+            </w:r>
+          </w:p>
+        </w:tc>
+        <w:tc>
+          <w:tcPr>
+            <w:tcW w:type="dxa" w:w="2351"/>
+          </w:tcPr>
+          <w:p>
+            <w:r>
+              <w:t>Bearer</w:t>
+            </w:r>
+          </w:p>
+        </w:tc>
+      </w:tr>
+      <w:tr>
+        <w:tc>
+          <w:tcPr>
+            <w:tcW w:type="dxa" w:w="2351"/>
+          </w:tcPr>
+          <w:p>
+            <w:r>
+              <w:t>POST</w:t>
+            </w:r>
+          </w:p>
+        </w:tc>
+        <w:tc>
+          <w:tcPr>
+            <w:tcW w:type="dxa" w:w="2351"/>
+          </w:tcPr>
+          <w:p>
+            <w:r>
+              <w:t>/api/mobile/sessions</w:t>
+            </w:r>
+          </w:p>
+        </w:tc>
+        <w:tc>
+          <w:tcPr>
+            <w:tcW w:type="dxa" w:w="2351"/>
+          </w:tcPr>
+          <w:p>
+            <w:r>
+              <w:t>Create session</w:t>
+            </w:r>
+          </w:p>
+        </w:tc>
+        <w:tc>
+          <w:tcPr>
+            <w:tcW w:type="dxa" w:w="2351"/>
+          </w:tcPr>
+          <w:p>
+            <w:r>
+              <w:t>Bearer</w:t>
+            </w:r>
+          </w:p>
+        </w:tc>
+      </w:tr>
+      <w:tr>
+        <w:tc>
+          <w:tcPr>
+            <w:tcW w:type="dxa" w:w="2351"/>
+          </w:tcPr>
+          <w:p>
+            <w:r>
+              <w:t>GET</w:t>
+            </w:r>
+          </w:p>
+        </w:tc>
+        <w:tc>
+          <w:tcPr>
+            <w:tcW w:type="dxa" w:w="2351"/>
+          </w:tcPr>
+          <w:p>
+            <w:r>
+              <w:t>/api/mobile/sessions/active</w:t>
+            </w:r>
+          </w:p>
+        </w:tc>
+        <w:tc>
+          <w:tcPr>
+            <w:tcW w:type="dxa" w:w="2351"/>
+          </w:tcPr>
+          <w:p>
+            <w:r>
+              <w:t>Active session</w:t>
+            </w:r>
+          </w:p>
+        </w:tc>
+        <w:tc>
+          <w:tcPr>
+            <w:tcW w:type="dxa" w:w="2351"/>
+          </w:tcPr>
+          <w:p>
+            <w:r>
+              <w:t>Bearer</w:t>
+            </w:r>
+          </w:p>
+        </w:tc>
+      </w:tr>
+      <w:tr>
+        <w:tc>
+          <w:tcPr>
+            <w:tcW w:type="dxa" w:w="2351"/>
+          </w:tcPr>
+          <w:p>
+            <w:r>
+              <w:t>GET</w:t>
+            </w:r>
+          </w:p>
+        </w:tc>
+        <w:tc>
+          <w:tcPr>
+            <w:tcW w:type="dxa" w:w="2351"/>
+          </w:tcPr>
+          <w:p>
+            <w:r>
+              <w:t>/api/mobile/wallet</w:t>
+            </w:r>
+          </w:p>
+        </w:tc>
+        <w:tc>
+          <w:tcPr>
+            <w:tcW w:type="dxa" w:w="2351"/>
+          </w:tcPr>
+          <w:p>
+            <w:r>
+              <w:t>Wallet balance</w:t>
+            </w:r>
+          </w:p>
+        </w:tc>
+        <w:tc>
+          <w:tcPr>
+            <w:tcW w:type="dxa" w:w="2351"/>
+          </w:tcPr>
+          <w:p>
+            <w:r>
+              <w:t>Bearer</w:t>
+            </w:r>
+          </w:p>
+        </w:tc>
+      </w:tr>
+      <w:tr>
+        <w:tc>
+          <w:tcPr>
+            <w:tcW w:type="dxa" w:w="2351"/>
+          </w:tcPr>
+          <w:p>
+            <w:r>
+              <w:t>POST</w:t>
+            </w:r>
+          </w:p>
+        </w:tc>
+        <w:tc>
+          <w:tcPr>
+            <w:tcW w:type="dxa" w:w="2351"/>
+          </w:tcPr>
+          <w:p>
+            <w:r>
+              <w:t>/api/mobile/wallet/deposit</w:t>
+            </w:r>
+          </w:p>
+        </w:tc>
+        <w:tc>
+          <w:tcPr>
+            <w:tcW w:type="dxa" w:w="2351"/>
+          </w:tcPr>
+          <w:p>
+            <w:r>
+              <w:t>Add funds</w:t>
+            </w:r>
+          </w:p>
+        </w:tc>
+        <w:tc>
+          <w:tcPr>
+            <w:tcW w:type="dxa" w:w="2351"/>
+          </w:tcPr>
+          <w:p>
+            <w:r>
+              <w:t>Bearer</w:t>
+            </w:r>
+          </w:p>
+        </w:tc>
+      </w:tr>
+      <w:tr>
+        <w:tc>
+          <w:tcPr>
+            <w:tcW w:type="dxa" w:w="2351"/>
+          </w:tcPr>
+          <w:p>
+            <w:r>
+              <w:t>GET</w:t>
+            </w:r>
+          </w:p>
+        </w:tc>
+        <w:tc>
+          <w:tcPr>
+            <w:tcW w:type="dxa" w:w="2351"/>
+          </w:tcPr>
+          <w:p>
+            <w:r>
+              <w:t>/api/mobile/wallet/transactions</w:t>
+            </w:r>
+          </w:p>
+        </w:tc>
+        <w:tc>
+          <w:tcPr>
+            <w:tcW w:type="dxa" w:w="2351"/>
+          </w:tcPr>
+          <w:p>
+            <w:r>
+              <w:t>Wallet history</w:t>
+            </w:r>
+          </w:p>
+        </w:tc>
+        <w:tc>
+          <w:tcPr>
+            <w:tcW w:type="dxa" w:w="2351"/>
+          </w:tcPr>
+          <w:p>
+            <w:r>
+              <w:t>Bearer</w:t>
+            </w:r>
+          </w:p>
+        </w:tc>
+      </w:tr>
+      <w:tr>
+        <w:tc>
+          <w:tcPr>
+            <w:tcW w:type="dxa" w:w="2351"/>
+          </w:tcPr>
+          <w:p>
+            <w:r>
+              <w:t>POST</w:t>
+            </w:r>
+          </w:p>
+        </w:tc>
+        <w:tc>
+          <w:tcPr>
+            <w:tcW w:type="dxa" w:w="2351"/>
+          </w:tcPr>
+          <w:p>
+            <w:r>
+              <w:t>/api/mobile/payments/process</w:t>
+            </w:r>
+          </w:p>
+        </w:tc>
+        <w:tc>
+          <w:tcPr>
+            <w:tcW w:type="dxa" w:w="2351"/>
+          </w:tcPr>
+          <w:p>
+            <w:r>
+              <w:t>Process payment</w:t>
+            </w:r>
+          </w:p>
+        </w:tc>
+        <w:tc>
+          <w:tcPr>
+            <w:tcW w:type="dxa" w:w="2351"/>
+          </w:tcPr>
+          <w:p>
+            <w:r>
+              <w:t>Bearer</w:t>
+            </w:r>
+          </w:p>
+        </w:tc>
+      </w:tr>
+      <w:tr>
+        <w:tc>
+          <w:tcPr>
+            <w:tcW w:type="dxa" w:w="2351"/>
+          </w:tcPr>
+          <w:p>
+            <w:r>
+              <w:t>POST</w:t>
+            </w:r>
+          </w:p>
+        </w:tc>
+        <w:tc>
+          <w:tcPr>
+            <w:tcW w:type="dxa" w:w="2351"/>
+          </w:tcPr>
+          <w:p>
+            <w:r>
+              <w:t>/api/mobile/qr/validate</w:t>
+            </w:r>
+          </w:p>
+        </w:tc>
+        <w:tc>
+          <w:tcPr>
+            <w:tcW w:type="dxa" w:w="2351"/>
+          </w:tcPr>
+          <w:p>
+            <w:r>
+              <w:t>Validate QR code</w:t>
+            </w:r>
+          </w:p>
+        </w:tc>
+        <w:tc>
+          <w:tcPr>
+            <w:tcW w:type="dxa" w:w="2351"/>
+          </w:tcPr>
+          <w:p>
+            <w:r>
+              <w:t>Bearer</w:t>
+            </w:r>
+          </w:p>
+        </w:tc>
+      </w:tr>
+      <w:tr>
+        <w:tc>
+          <w:tcPr>
+            <w:tcW w:type="dxa" w:w="2351"/>
+          </w:tcPr>
+          <w:p>
+            <w:r>
+              <w:t>GET</w:t>
+            </w:r>
+          </w:p>
+        </w:tc>
+        <w:tc>
+          <w:tcPr>
+            <w:tcW w:type="dxa" w:w="2351"/>
+          </w:tcPr>
+          <w:p>
+            <w:r>
+              <w:t>/api/mobile/profile</w:t>
+            </w:r>
+          </w:p>
+        </w:tc>
+        <w:tc>
+          <w:tcPr>
+            <w:tcW w:type="dxa" w:w="2351"/>
+          </w:tcPr>
+          <w:p>
+            <w:r>
+              <w:t>User profile</w:t>
+            </w:r>
+          </w:p>
+        </w:tc>
+        <w:tc>
+          <w:tcPr>
+            <w:tcW w:type="dxa" w:w="2351"/>
+          </w:tcPr>
+          <w:p>
+            <w:r>
+              <w:t>Bearer</w:t>
+            </w:r>
+          </w:p>
+        </w:tc>
+      </w:tr>
+      <w:tr>
+        <w:tc>
+          <w:tcPr>
+            <w:tcW w:type="dxa" w:w="2351"/>
+          </w:tcPr>
+          <w:p>
+            <w:r>
+              <w:t>PATCH</w:t>
+            </w:r>
+          </w:p>
+        </w:tc>
+        <w:tc>
+          <w:tcPr>
+            <w:tcW w:type="dxa" w:w="2351"/>
+          </w:tcPr>
+          <w:p>
+            <w:r>
+              <w:t>/api/mobile/profile</w:t>
+            </w:r>
+          </w:p>
+        </w:tc>
+        <w:tc>
+          <w:tcPr>
+            <w:tcW w:type="dxa" w:w="2351"/>
+          </w:tcPr>
+          <w:p>
+            <w:r>
+              <w:t>Update profile</w:t>
+            </w:r>
+          </w:p>
+        </w:tc>
+        <w:tc>
+          <w:tcPr>
+            <w:tcW w:type="dxa" w:w="2351"/>
+          </w:tcPr>
+          <w:p>
+            <w:r>
+              <w:t>Bearer</w:t>
+            </w:r>
+          </w:p>
+        </w:tc>
+      </w:tr>
+      <w:tr>
+        <w:tc>
+          <w:tcPr>
+            <w:tcW w:type="dxa" w:w="2351"/>
+          </w:tcPr>
+          <w:p>
+            <w:r>
+              <w:t>GET</w:t>
+            </w:r>
+          </w:p>
+        </w:tc>
+        <w:tc>
+          <w:tcPr>
+            <w:tcW w:type="dxa" w:w="2351"/>
+          </w:tcPr>
+          <w:p>
+            <w:r>
+              <w:t>/api/mobile/notifications</w:t>
+            </w:r>
+          </w:p>
+        </w:tc>
+        <w:tc>
+          <w:tcPr>
+            <w:tcW w:type="dxa" w:w="2351"/>
+          </w:tcPr>
+          <w:p>
+            <w:r>
+              <w:t>Get notifications</w:t>
+            </w:r>
+          </w:p>
+        </w:tc>
+        <w:tc>
+          <w:tcPr>
+            <w:tcW w:type="dxa" w:w="2351"/>
+          </w:tcPr>
+          <w:p>
+            <w:r>
+              <w:t>Bearer</w:t>
+            </w:r>
+          </w:p>
+        </w:tc>
+      </w:tr>
+    </w:tbl>
+    <w:p>
       <w:r>
         <w:br w:type="page"/>
       </w:r>
@@ -10480,7 +12786,7 @@
         <w:t xml:space="preserve">Document Version: </w:t>
       </w:r>
       <w:r>
-        <w:t>1.0</w:t>
+        <w:t>2.0</w:t>
       </w:r>
     </w:p>
     <w:p>
@@ -10502,7 +12808,7 @@
         <w:t xml:space="preserve">Last Updated: </w:t>
       </w:r>
       <w:r>
-        <w:t>January 2026</w:t>
+        <w:t>February 2026</w:t>
       </w:r>
     </w:p>
     <w:p>

</xml_diff>